<commit_message>
fix: Noite 2 - slides de correcao na mesma ordem e numeracao da folha
Pense como tecnico do roteador reordenado (WAN, fonte, 300 Mega) e novo
slide com as 3 respostas do modem de fibra, incluindo onde vai ligado.

Co-Authored-By: Claude Opus 5.5 <noreply@anthropic.com>
Claude-Session: https://claude.ai/code/session_015y4tKZEhCyJs3fFMDuZmcy
</commit_message>
<xml_diff>
--- a/Roteiro - Redes 2 - Como a internet chega.docx
+++ b/Roteiro - Redes 2 - Como a internet chega.docx
@@ -2722,7 +2722,7 @@
           <w:i w:val="0"/>
           <w:sz w:val="22"/>
         </w:rPr>
-        <w:t>Quatro slides de correção. Pergunte às equipes antes de mostrar cada um:</w:t>
+        <w:t>Cinco slides de correção, na mesma ordem das perguntas da folha. Pergunte às equipes antes de mostrar cada um:</w:t>
       </w:r>
     </w:p>
     <w:p>
@@ -2746,7 +2746,7 @@
         <w:rPr>
           <w:sz w:val="22"/>
         </w:rPr>
-        <w:t>Pense como técnico: a fonte de um NÃO serve no outro; pra 300 Mega no cabo, só o Archer (as portas do 840N param em ~94 Mbps)</w:t>
+        <w:t>Pense como técnico · roteador (pág. 3): 1) WAN = porta separada, outra cor, escrito WAN/Internet; 2) a fonte de um NÃO serve no outro (9V × 12V); 3) pra 300 Mega no cabo, só o Archer (as portas do 840N param em ~94 Mbps)</w:t>
       </w:r>
     </w:p>
     <w:p>
@@ -2770,7 +2770,7 @@
         <w:rPr>
           <w:sz w:val="22"/>
         </w:rPr>
-        <w:t>Modem: a fonte de 12V 1,5A liga o AN5506 (mesma tensão, sobra corrente); a de 12V 1A no HG6143D NÃO serve (falta corrente). Trocou a ONU? O provedor precisa do novo GPON SN pra liberar</w:t>
+        <w:t>Pense como técnico · modem (pág. 4): 1) falta um roteador, ligado da LAN da ONU para a WAN do roteador; 2) a fonte de 12V 1,5A liga o AN5506 (mesma tensão, sobra corrente), a de 12V 1A no HG6143D NÃO serve (falta corrente); 3) o provedor pede o GPON SN novo, é por ele que reconhece e libera o aparelho</w:t>
       </w:r>
     </w:p>
     <w:p>

</xml_diff>